<commit_message>
Minor change: Removed version on titlescreen as the version is already displayed in the table below it.
</commit_message>
<xml_diff>
--- a/StrategyPattern/API 3 - 001 - Strategy Pattern.docx
+++ b/StrategyPattern/API 3 - 001 - Strategy Pattern.docx
@@ -11,54 +11,17 @@
         </w:rPr>
       </w:pPr>
       <w:r>
-        <w:t xml:space="preserve">Design </w:t>
-      </w:r>
-      <w:proofErr w:type="spellStart"/>
-      <w:r>
-        <w:t>Patterns</w:t>
-      </w:r>
-      <w:proofErr w:type="spellEnd"/>
-      <w:r>
-        <w:t xml:space="preserve"> -</w:t>
+        <w:t>Design Patterns -</w:t>
       </w:r>
       <w:r>
         <w:t xml:space="preserve"> </w:t>
       </w:r>
-      <w:proofErr w:type="spellStart"/>
       <w:r>
         <w:t>Strategy</w:t>
       </w:r>
-      <w:proofErr w:type="spellEnd"/>
-      <w:r>
-        <w:t xml:space="preserve"> </w:t>
-      </w:r>
-      <w:proofErr w:type="spellStart"/>
-      <w:r>
-        <w:t>Pattern</w:t>
-      </w:r>
-      <w:proofErr w:type="spellEnd"/>
-    </w:p>
-    <w:p>
-      <w:pPr>
-        <w:pStyle w:val="Ondertitel"/>
-        <w:rPr>
-          <w:rFonts w:ascii="Calibri" w:hAnsi="Calibri" w:cs="Calibri"/>
-          <w:sz w:val="28"/>
-          <w:szCs w:val="28"/>
-        </w:rPr>
-      </w:pPr>
-      <w:r>
-        <w:t>Versie 1.0.</w:t>
-      </w:r>
-      <w:r>
-        <w:t>0</w:t>
-      </w:r>
-    </w:p>
-    <w:p/>
-    <w:p>
-      <w:pPr>
-        <w:pStyle w:val="Lijstalinea"/>
-      </w:pPr>
+      <w:r>
+        <w:t xml:space="preserve"> Pattern</w:t>
+      </w:r>
     </w:p>
     <w:p>
       <w:r>
@@ -284,15 +247,7 @@
               <w:pStyle w:val="Plattetekst"/>
             </w:pPr>
             <w:r>
-              <w:t xml:space="preserve">De codebase en dit document zijn voortaan te vinden in een GIT </w:t>
-            </w:r>
-            <w:proofErr w:type="spellStart"/>
-            <w:r>
-              <w:t>repository</w:t>
-            </w:r>
-            <w:proofErr w:type="spellEnd"/>
-            <w:r>
-              <w:t>. Link is toegevoegd</w:t>
+              <w:t>De codebase en dit document zijn voortaan te vinden in een GIT repository. Link is toegevoegd</w:t>
             </w:r>
           </w:p>
           <w:p>
@@ -868,55 +823,7 @@
           <w:szCs w:val="20"/>
           <w:lang w:val="en-GB"/>
         </w:rPr>
-        <w:t xml:space="preserve"> </w:t>
-      </w:r>
-      <w:proofErr w:type="spellStart"/>
-      <w:r>
-        <w:rPr>
-          <w:rFonts w:ascii="Cascadia Mono" w:eastAsia="+mn-ea" w:hAnsi="Cascadia Mono" w:cs="+mn-cs"/>
-          <w:color w:val="000000"/>
-          <w:kern w:val="24"/>
-          <w:sz w:val="20"/>
-          <w:szCs w:val="20"/>
-          <w:lang w:val="en-GB"/>
-        </w:rPr>
-        <w:t>QuackBehavior</w:t>
-      </w:r>
-      <w:proofErr w:type="spellEnd"/>
-      <w:r>
-        <w:rPr>
-          <w:rFonts w:ascii="Cascadia Mono" w:eastAsia="+mn-ea" w:hAnsi="Cascadia Mono" w:cs="+mn-cs"/>
-          <w:color w:val="000000"/>
-          <w:kern w:val="24"/>
-          <w:sz w:val="20"/>
-          <w:szCs w:val="20"/>
-          <w:lang w:val="en-GB"/>
-        </w:rPr>
-        <w:t xml:space="preserve"> </w:t>
-      </w:r>
-      <w:proofErr w:type="spellStart"/>
-      <w:r>
-        <w:rPr>
-          <w:rFonts w:ascii="Cascadia Mono" w:eastAsia="+mn-ea" w:hAnsi="Cascadia Mono" w:cs="+mn-cs"/>
-          <w:color w:val="000000"/>
-          <w:kern w:val="24"/>
-          <w:sz w:val="20"/>
-          <w:szCs w:val="20"/>
-          <w:lang w:val="en-GB"/>
-        </w:rPr>
-        <w:t>quackBehavior</w:t>
-      </w:r>
-      <w:proofErr w:type="spellEnd"/>
-      <w:r>
-        <w:rPr>
-          <w:rFonts w:ascii="Cascadia Mono" w:eastAsia="+mn-ea" w:hAnsi="Cascadia Mono" w:cs="+mn-cs"/>
-          <w:color w:val="000000"/>
-          <w:kern w:val="24"/>
-          <w:sz w:val="20"/>
-          <w:szCs w:val="20"/>
-          <w:lang w:val="en-GB"/>
-        </w:rPr>
-        <w:t>;</w:t>
+        <w:t xml:space="preserve"> QuackBehavior quackBehavior;</w:t>
       </w:r>
     </w:p>
     <w:p>
@@ -956,55 +863,7 @@
           <w:szCs w:val="20"/>
           <w:lang w:val="en-GB"/>
         </w:rPr>
-        <w:t xml:space="preserve"> </w:t>
-      </w:r>
-      <w:proofErr w:type="spellStart"/>
-      <w:r>
-        <w:rPr>
-          <w:rFonts w:ascii="Cascadia Mono" w:eastAsia="+mn-ea" w:hAnsi="Cascadia Mono" w:cs="+mn-cs"/>
-          <w:color w:val="000000"/>
-          <w:kern w:val="24"/>
-          <w:sz w:val="20"/>
-          <w:szCs w:val="20"/>
-          <w:lang w:val="en-GB"/>
-        </w:rPr>
-        <w:t>FlyBehavior</w:t>
-      </w:r>
-      <w:proofErr w:type="spellEnd"/>
-      <w:r>
-        <w:rPr>
-          <w:rFonts w:ascii="Cascadia Mono" w:eastAsia="+mn-ea" w:hAnsi="Cascadia Mono" w:cs="+mn-cs"/>
-          <w:color w:val="000000"/>
-          <w:kern w:val="24"/>
-          <w:sz w:val="20"/>
-          <w:szCs w:val="20"/>
-          <w:lang w:val="en-GB"/>
-        </w:rPr>
-        <w:t xml:space="preserve"> </w:t>
-      </w:r>
-      <w:proofErr w:type="spellStart"/>
-      <w:r>
-        <w:rPr>
-          <w:rFonts w:ascii="Cascadia Mono" w:eastAsia="+mn-ea" w:hAnsi="Cascadia Mono" w:cs="+mn-cs"/>
-          <w:color w:val="000000"/>
-          <w:kern w:val="24"/>
-          <w:sz w:val="20"/>
-          <w:szCs w:val="20"/>
-          <w:lang w:val="en-GB"/>
-        </w:rPr>
-        <w:t>flyBehavior</w:t>
-      </w:r>
-      <w:proofErr w:type="spellEnd"/>
-      <w:r>
-        <w:rPr>
-          <w:rFonts w:ascii="Cascadia Mono" w:eastAsia="+mn-ea" w:hAnsi="Cascadia Mono" w:cs="+mn-cs"/>
-          <w:color w:val="000000"/>
-          <w:kern w:val="24"/>
-          <w:sz w:val="20"/>
-          <w:szCs w:val="20"/>
-          <w:lang w:val="en-GB"/>
-        </w:rPr>
-        <w:t>;</w:t>
+        <w:t xml:space="preserve"> FlyBehavior flyBehavior;</w:t>
       </w:r>
     </w:p>
     <w:p>
@@ -1088,31 +947,7 @@
           <w:szCs w:val="20"/>
           <w:lang w:val="en-GB"/>
         </w:rPr>
-        <w:t xml:space="preserve"> </w:t>
-      </w:r>
-      <w:proofErr w:type="gramStart"/>
-      <w:r>
-        <w:rPr>
-          <w:rFonts w:ascii="Cascadia Mono" w:eastAsia="+mn-ea" w:hAnsi="Cascadia Mono" w:cs="+mn-cs"/>
-          <w:color w:val="000000"/>
-          <w:kern w:val="24"/>
-          <w:sz w:val="20"/>
-          <w:szCs w:val="20"/>
-          <w:lang w:val="en-GB"/>
-        </w:rPr>
-        <w:t>Display(</w:t>
-      </w:r>
-      <w:proofErr w:type="gramEnd"/>
-      <w:r>
-        <w:rPr>
-          <w:rFonts w:ascii="Cascadia Mono" w:eastAsia="+mn-ea" w:hAnsi="Cascadia Mono" w:cs="+mn-cs"/>
-          <w:color w:val="000000"/>
-          <w:kern w:val="24"/>
-          <w:sz w:val="20"/>
-          <w:szCs w:val="20"/>
-          <w:lang w:val="en-GB"/>
-        </w:rPr>
-        <w:t>);</w:t>
+        <w:t xml:space="preserve"> Display();</w:t>
       </w:r>
     </w:p>
     <w:p>
@@ -1174,44 +1009,7 @@
           <w:szCs w:val="20"/>
           <w:lang w:val="en-GB"/>
         </w:rPr>
-        <w:t xml:space="preserve"> </w:t>
-      </w:r>
-      <w:proofErr w:type="spellStart"/>
-      <w:proofErr w:type="gramStart"/>
-      <w:r>
-        <w:rPr>
-          <w:rFonts w:ascii="Cascadia Mono" w:eastAsia="+mn-ea" w:hAnsi="Cascadia Mono" w:cs="+mn-cs"/>
-          <w:color w:val="000000"/>
-          <w:kern w:val="24"/>
-          <w:sz w:val="20"/>
-          <w:szCs w:val="20"/>
-          <w:lang w:val="en-GB"/>
-        </w:rPr>
-        <w:t>PerformQuack</w:t>
-      </w:r>
-      <w:proofErr w:type="spellEnd"/>
-      <w:r>
-        <w:rPr>
-          <w:rFonts w:ascii="Cascadia Mono" w:eastAsia="+mn-ea" w:hAnsi="Cascadia Mono" w:cs="+mn-cs"/>
-          <w:color w:val="000000"/>
-          <w:kern w:val="24"/>
-          <w:sz w:val="20"/>
-          <w:szCs w:val="20"/>
-          <w:lang w:val="en-GB"/>
-        </w:rPr>
-        <w:t>(</w:t>
-      </w:r>
-      <w:proofErr w:type="gramEnd"/>
-      <w:r>
-        <w:rPr>
-          <w:rFonts w:ascii="Cascadia Mono" w:eastAsia="+mn-ea" w:hAnsi="Cascadia Mono" w:cs="+mn-cs"/>
-          <w:color w:val="000000"/>
-          <w:kern w:val="24"/>
-          <w:sz w:val="20"/>
-          <w:szCs w:val="20"/>
-          <w:lang w:val="en-GB"/>
-        </w:rPr>
-        <w:t>)</w:t>
+        <w:t xml:space="preserve"> PerformQuack()</w:t>
       </w:r>
     </w:p>
     <w:p>
@@ -1281,7 +1079,6 @@
         </w:rPr>
         <w:tab/>
       </w:r>
-      <w:proofErr w:type="spellStart"/>
       <w:r>
         <w:rPr>
           <w:rFonts w:ascii="Cascadia Mono" w:eastAsia="+mn-ea" w:hAnsi="Cascadia Mono" w:cs="+mn-cs"/>
@@ -1291,19 +1088,7 @@
           <w:szCs w:val="20"/>
           <w:lang w:val="en-GB"/>
         </w:rPr>
-        <w:t>quackBehavior.Quack</w:t>
-      </w:r>
-      <w:proofErr w:type="spellEnd"/>
-      <w:r>
-        <w:rPr>
-          <w:rFonts w:ascii="Cascadia Mono" w:eastAsia="+mn-ea" w:hAnsi="Cascadia Mono" w:cs="+mn-cs"/>
-          <w:color w:val="000000"/>
-          <w:kern w:val="24"/>
-          <w:sz w:val="20"/>
-          <w:szCs w:val="20"/>
-          <w:lang w:val="en-GB"/>
-        </w:rPr>
-        <w:t>();</w:t>
+        <w:t>quackBehavior.Quack();</w:t>
       </w:r>
     </w:p>
     <w:p>
@@ -1394,44 +1179,7 @@
           <w:szCs w:val="20"/>
           <w:lang w:val="en-GB"/>
         </w:rPr>
-        <w:t xml:space="preserve"> </w:t>
-      </w:r>
-      <w:proofErr w:type="spellStart"/>
-      <w:proofErr w:type="gramStart"/>
-      <w:r>
-        <w:rPr>
-          <w:rFonts w:ascii="Cascadia Mono" w:eastAsia="+mn-ea" w:hAnsi="Cascadia Mono" w:cs="+mn-cs"/>
-          <w:color w:val="000000"/>
-          <w:kern w:val="24"/>
-          <w:sz w:val="20"/>
-          <w:szCs w:val="20"/>
-          <w:lang w:val="en-GB"/>
-        </w:rPr>
-        <w:t>PerformFly</w:t>
-      </w:r>
-      <w:proofErr w:type="spellEnd"/>
-      <w:r>
-        <w:rPr>
-          <w:rFonts w:ascii="Cascadia Mono" w:eastAsia="+mn-ea" w:hAnsi="Cascadia Mono" w:cs="+mn-cs"/>
-          <w:color w:val="000000"/>
-          <w:kern w:val="24"/>
-          <w:sz w:val="20"/>
-          <w:szCs w:val="20"/>
-          <w:lang w:val="en-GB"/>
-        </w:rPr>
-        <w:t>(</w:t>
-      </w:r>
-      <w:proofErr w:type="gramEnd"/>
-      <w:r>
-        <w:rPr>
-          <w:rFonts w:ascii="Cascadia Mono" w:eastAsia="+mn-ea" w:hAnsi="Cascadia Mono" w:cs="+mn-cs"/>
-          <w:color w:val="000000"/>
-          <w:kern w:val="24"/>
-          <w:sz w:val="20"/>
-          <w:szCs w:val="20"/>
-          <w:lang w:val="en-GB"/>
-        </w:rPr>
-        <w:t>)</w:t>
+        <w:t xml:space="preserve"> PerformFly()</w:t>
       </w:r>
     </w:p>
     <w:p>
@@ -1500,30 +1248,7 @@
           <w:lang w:val="en-GB"/>
         </w:rPr>
         <w:tab/>
-      </w:r>
-      <w:proofErr w:type="spellStart"/>
-      <w:r>
-        <w:rPr>
-          <w:rFonts w:ascii="Cascadia Mono" w:eastAsia="+mn-ea" w:hAnsi="Cascadia Mono" w:cs="+mn-cs"/>
-          <w:color w:val="000000"/>
-          <w:kern w:val="24"/>
-          <w:sz w:val="20"/>
-          <w:szCs w:val="20"/>
-          <w:lang w:val="en-GB"/>
-        </w:rPr>
-        <w:t>flyBehavior.Fly</w:t>
-      </w:r>
-      <w:proofErr w:type="spellEnd"/>
-      <w:r>
-        <w:rPr>
-          <w:rFonts w:ascii="Cascadia Mono" w:eastAsia="+mn-ea" w:hAnsi="Cascadia Mono" w:cs="+mn-cs"/>
-          <w:color w:val="000000"/>
-          <w:kern w:val="24"/>
-          <w:sz w:val="20"/>
-          <w:szCs w:val="20"/>
-          <w:lang w:val="en-GB"/>
-        </w:rPr>
-        <w:t>();</w:t>
+        <w:t>flyBehavior.Fly();</w:t>
       </w:r>
     </w:p>
     <w:p>
@@ -1614,31 +1339,7 @@
           <w:szCs w:val="20"/>
           <w:lang w:val="en-GB"/>
         </w:rPr>
-        <w:t xml:space="preserve"> </w:t>
-      </w:r>
-      <w:proofErr w:type="gramStart"/>
-      <w:r>
-        <w:rPr>
-          <w:rFonts w:ascii="Cascadia Mono" w:eastAsia="+mn-ea" w:hAnsi="Cascadia Mono" w:cs="+mn-cs"/>
-          <w:color w:val="000000"/>
-          <w:kern w:val="24"/>
-          <w:sz w:val="20"/>
-          <w:szCs w:val="20"/>
-          <w:lang w:val="en-GB"/>
-        </w:rPr>
-        <w:t>Swim(</w:t>
-      </w:r>
-      <w:proofErr w:type="gramEnd"/>
-      <w:r>
-        <w:rPr>
-          <w:rFonts w:ascii="Cascadia Mono" w:eastAsia="+mn-ea" w:hAnsi="Cascadia Mono" w:cs="+mn-cs"/>
-          <w:color w:val="000000"/>
-          <w:kern w:val="24"/>
-          <w:sz w:val="20"/>
-          <w:szCs w:val="20"/>
-          <w:lang w:val="en-GB"/>
-        </w:rPr>
-        <w:t>)</w:t>
+        <w:t xml:space="preserve"> Swim()</w:t>
       </w:r>
     </w:p>
     <w:p>
@@ -1701,7 +1402,6 @@
           <w:lang w:val="en-GB"/>
         </w:rPr>
       </w:pPr>
-      <w:proofErr w:type="spellStart"/>
       <w:r>
         <w:rPr>
           <w:rFonts w:ascii="Cascadia Mono" w:eastAsia="+mn-ea" w:hAnsi="Cascadia Mono" w:cs="+mn-cs"/>
@@ -1711,19 +1411,7 @@
           <w:szCs w:val="20"/>
           <w:lang w:val="en-US"/>
         </w:rPr>
-        <w:t>Console.WriteLine</w:t>
-      </w:r>
-      <w:proofErr w:type="spellEnd"/>
-      <w:r>
-        <w:rPr>
-          <w:rFonts w:ascii="Cascadia Mono" w:eastAsia="+mn-ea" w:hAnsi="Cascadia Mono" w:cs="+mn-cs"/>
-          <w:color w:val="000000"/>
-          <w:kern w:val="24"/>
-          <w:sz w:val="20"/>
-          <w:szCs w:val="20"/>
-          <w:lang w:val="en-US"/>
-        </w:rPr>
-        <w:t>(</w:t>
+        <w:t>Console.WriteLine(</w:t>
       </w:r>
       <w:r>
         <w:rPr>
@@ -1825,14 +1513,9 @@
         <w:t>Opdracht #2</w:t>
       </w:r>
       <w:r>
-        <w:t xml:space="preserve"> – </w:t>
-      </w:r>
-      <w:proofErr w:type="spellStart"/>
-      <w:r>
-        <w:t>Implementing</w:t>
+        <w:t xml:space="preserve"> – Implementing</w:t>
       </w:r>
       <w:bookmarkEnd w:id="1"/>
-      <w:proofErr w:type="spellEnd"/>
       <w:r>
         <w:t xml:space="preserve"> </w:t>
       </w:r>
@@ -1850,39 +1533,7 @@
           <w:sz w:val="28"/>
           <w:szCs w:val="28"/>
         </w:rPr>
-        <w:t xml:space="preserve">De concrete </w:t>
-      </w:r>
-      <w:proofErr w:type="spellStart"/>
-      <w:r>
-        <w:rPr>
-          <w:sz w:val="28"/>
-          <w:szCs w:val="28"/>
-        </w:rPr>
-        <w:t>FlyBehavior</w:t>
-      </w:r>
-      <w:proofErr w:type="spellEnd"/>
-      <w:r>
-        <w:rPr>
-          <w:sz w:val="28"/>
-          <w:szCs w:val="28"/>
-        </w:rPr>
-        <w:t xml:space="preserve"> en </w:t>
-      </w:r>
-      <w:proofErr w:type="spellStart"/>
-      <w:r>
-        <w:rPr>
-          <w:sz w:val="28"/>
-          <w:szCs w:val="28"/>
-        </w:rPr>
-        <w:t>QuackBehavior</w:t>
-      </w:r>
-      <w:proofErr w:type="spellEnd"/>
-      <w:r>
-        <w:rPr>
-          <w:sz w:val="28"/>
-          <w:szCs w:val="28"/>
-        </w:rPr>
-        <w:t xml:space="preserve"> classes ontbreken nog aan de solution. Voeg deze classes toe en laat ze de toepasselijke interface implementeren.</w:t>
+        <w:t>De concrete FlyBehavior en QuackBehavior classes ontbreken nog aan de solution. Voeg deze classes toe en laat ze de toepasselijke interface implementeren.</w:t>
       </w:r>
     </w:p>
     <w:p>
@@ -1895,7 +1546,6 @@
           <w:szCs w:val="28"/>
         </w:rPr>
       </w:pPr>
-      <w:proofErr w:type="spellStart"/>
       <w:r>
         <w:rPr>
           <w:b/>
@@ -1903,17 +1553,7 @@
           <w:sz w:val="28"/>
           <w:szCs w:val="28"/>
         </w:rPr>
-        <w:t>QuackBehavior</w:t>
-      </w:r>
-      <w:proofErr w:type="spellEnd"/>
-      <w:r>
-        <w:rPr>
-          <w:b/>
-          <w:bCs/>
-          <w:sz w:val="28"/>
-          <w:szCs w:val="28"/>
-        </w:rPr>
-        <w:t>:</w:t>
+        <w:t>QuackBehavior:</w:t>
       </w:r>
     </w:p>
     <w:p>
@@ -1928,7 +1568,6 @@
           <w:szCs w:val="28"/>
         </w:rPr>
       </w:pPr>
-      <w:proofErr w:type="spellStart"/>
       <w:r>
         <w:rPr>
           <w:i/>
@@ -1938,29 +1577,12 @@
         </w:rPr>
         <w:t>RegularQuack</w:t>
       </w:r>
-      <w:proofErr w:type="spellEnd"/>
-      <w:r>
-        <w:rPr>
-          <w:sz w:val="28"/>
-          <w:szCs w:val="28"/>
-        </w:rPr>
-        <w:t xml:space="preserve"> moet “</w:t>
-      </w:r>
-      <w:proofErr w:type="spellStart"/>
-      <w:r>
-        <w:rPr>
-          <w:sz w:val="28"/>
-          <w:szCs w:val="28"/>
-        </w:rPr>
-        <w:t>quack</w:t>
-      </w:r>
-      <w:proofErr w:type="spellEnd"/>
-      <w:r>
-        <w:rPr>
-          <w:sz w:val="28"/>
-          <w:szCs w:val="28"/>
-        </w:rPr>
-        <w:t>” printen</w:t>
+      <w:r>
+        <w:rPr>
+          <w:sz w:val="28"/>
+          <w:szCs w:val="28"/>
+        </w:rPr>
+        <w:t xml:space="preserve"> moet “quack” printen</w:t>
       </w:r>
     </w:p>
     <w:p>
@@ -1975,7 +1597,6 @@
           <w:szCs w:val="28"/>
         </w:rPr>
       </w:pPr>
-      <w:proofErr w:type="spellStart"/>
       <w:r>
         <w:rPr>
           <w:i/>
@@ -1985,29 +1606,12 @@
         </w:rPr>
         <w:t>MuteQuack</w:t>
       </w:r>
-      <w:proofErr w:type="spellEnd"/>
-      <w:r>
-        <w:rPr>
-          <w:sz w:val="28"/>
-          <w:szCs w:val="28"/>
-        </w:rPr>
-        <w:t xml:space="preserve"> moet “&lt;&lt;</w:t>
-      </w:r>
-      <w:proofErr w:type="spellStart"/>
-      <w:r>
-        <w:rPr>
-          <w:sz w:val="28"/>
-          <w:szCs w:val="28"/>
-        </w:rPr>
-        <w:t>Silence</w:t>
-      </w:r>
-      <w:proofErr w:type="spellEnd"/>
-      <w:r>
-        <w:rPr>
-          <w:sz w:val="28"/>
-          <w:szCs w:val="28"/>
-        </w:rPr>
-        <w:t>&gt;&gt;” printen</w:t>
+      <w:r>
+        <w:rPr>
+          <w:sz w:val="28"/>
+          <w:szCs w:val="28"/>
+        </w:rPr>
+        <w:t xml:space="preserve"> moet “&lt;&lt;Silence&gt;&gt;” printen</w:t>
       </w:r>
     </w:p>
     <w:p>
@@ -2022,7 +1626,6 @@
           <w:szCs w:val="28"/>
         </w:rPr>
       </w:pPr>
-      <w:proofErr w:type="spellStart"/>
       <w:r>
         <w:rPr>
           <w:i/>
@@ -2032,29 +1635,12 @@
         </w:rPr>
         <w:t>Squeak</w:t>
       </w:r>
-      <w:proofErr w:type="spellEnd"/>
-      <w:r>
-        <w:rPr>
-          <w:sz w:val="28"/>
-          <w:szCs w:val="28"/>
-        </w:rPr>
-        <w:t xml:space="preserve"> moet “</w:t>
-      </w:r>
-      <w:proofErr w:type="spellStart"/>
-      <w:r>
-        <w:rPr>
-          <w:sz w:val="28"/>
-          <w:szCs w:val="28"/>
-        </w:rPr>
-        <w:t>Squeak</w:t>
-      </w:r>
-      <w:proofErr w:type="spellEnd"/>
-      <w:r>
-        <w:rPr>
-          <w:sz w:val="28"/>
-          <w:szCs w:val="28"/>
-        </w:rPr>
-        <w:t>” printen</w:t>
+      <w:r>
+        <w:rPr>
+          <w:sz w:val="28"/>
+          <w:szCs w:val="28"/>
+        </w:rPr>
+        <w:t xml:space="preserve"> moet “Squeak” printen</w:t>
       </w:r>
     </w:p>
     <w:p>
@@ -2076,7 +1662,6 @@
           <w:szCs w:val="28"/>
         </w:rPr>
       </w:pPr>
-      <w:proofErr w:type="spellStart"/>
       <w:r>
         <w:rPr>
           <w:b/>
@@ -2084,17 +1669,7 @@
           <w:sz w:val="28"/>
           <w:szCs w:val="28"/>
         </w:rPr>
-        <w:t>FlyBehavior</w:t>
-      </w:r>
-      <w:proofErr w:type="spellEnd"/>
-      <w:r>
-        <w:rPr>
-          <w:b/>
-          <w:bCs/>
-          <w:sz w:val="28"/>
-          <w:szCs w:val="28"/>
-        </w:rPr>
-        <w:t>:</w:t>
+        <w:t>FlyBehavior:</w:t>
       </w:r>
     </w:p>
     <w:p>
@@ -2112,7 +1687,6 @@
           <w:lang w:val="en-GB"/>
         </w:rPr>
       </w:pPr>
-      <w:proofErr w:type="spellStart"/>
       <w:r>
         <w:rPr>
           <w:i/>
@@ -2121,53 +1695,8 @@
           <w:szCs w:val="28"/>
           <w:lang w:val="en-GB"/>
         </w:rPr>
-        <w:t>FlyWithWings</w:t>
-      </w:r>
-      <w:proofErr w:type="spellEnd"/>
-      <w:r>
-        <w:rPr>
-          <w:i/>
-          <w:iCs/>
-          <w:sz w:val="28"/>
-          <w:szCs w:val="28"/>
-          <w:lang w:val="en-GB"/>
-        </w:rPr>
-        <w:t xml:space="preserve"> </w:t>
-      </w:r>
-      <w:proofErr w:type="spellStart"/>
-      <w:r>
-        <w:rPr>
-          <w:i/>
-          <w:iCs/>
-          <w:sz w:val="28"/>
-          <w:szCs w:val="28"/>
-          <w:lang w:val="en-GB"/>
-        </w:rPr>
-        <w:t>moet</w:t>
-      </w:r>
-      <w:proofErr w:type="spellEnd"/>
-      <w:r>
-        <w:rPr>
-          <w:i/>
-          <w:iCs/>
-          <w:sz w:val="28"/>
-          <w:szCs w:val="28"/>
-          <w:lang w:val="en-GB"/>
-        </w:rPr>
-        <w:t xml:space="preserve"> “I’m flying using my wings!” </w:t>
-      </w:r>
-      <w:proofErr w:type="spellStart"/>
-      <w:r>
-        <w:rPr>
-          <w:i/>
-          <w:iCs/>
-          <w:sz w:val="28"/>
-          <w:szCs w:val="28"/>
-          <w:lang w:val="en-GB"/>
-        </w:rPr>
-        <w:t>printen</w:t>
-      </w:r>
-      <w:proofErr w:type="spellEnd"/>
+        <w:t>FlyWithWings moet “I’m flying using my wings!” printen</w:t>
+      </w:r>
     </w:p>
     <w:p>
       <w:pPr>
@@ -2182,7 +1711,6 @@
           <w:lang w:val="en-GB"/>
         </w:rPr>
       </w:pPr>
-      <w:proofErr w:type="spellStart"/>
       <w:r>
         <w:rPr>
           <w:i/>
@@ -2193,43 +1721,14 @@
         </w:rPr>
         <w:t>FlyNoWay</w:t>
       </w:r>
-      <w:proofErr w:type="spellEnd"/>
       <w:r>
         <w:rPr>
           <w:sz w:val="28"/>
           <w:szCs w:val="28"/>
           <w:lang w:val="en-GB"/>
         </w:rPr>
-        <w:t xml:space="preserve"> </w:t>
-      </w:r>
-      <w:proofErr w:type="spellStart"/>
-      <w:r>
-        <w:rPr>
-          <w:sz w:val="28"/>
-          <w:szCs w:val="28"/>
-          <w:lang w:val="en-GB"/>
-        </w:rPr>
-        <w:t>moet</w:t>
-      </w:r>
-      <w:proofErr w:type="spellEnd"/>
-      <w:r>
-        <w:rPr>
-          <w:sz w:val="28"/>
-          <w:szCs w:val="28"/>
-          <w:lang w:val="en-GB"/>
-        </w:rPr>
-        <w:t xml:space="preserve"> “I can’t fly!” </w:t>
-      </w:r>
-      <w:proofErr w:type="spellStart"/>
-      <w:r>
-        <w:rPr>
-          <w:sz w:val="28"/>
-          <w:szCs w:val="28"/>
-          <w:lang w:val="en-GB"/>
-        </w:rPr>
-        <w:t>printen</w:t>
-      </w:r>
-      <w:proofErr w:type="spellEnd"/>
+        <w:t xml:space="preserve"> moet “I can’t fly!” printen</w:t>
+      </w:r>
     </w:p>
     <w:p>
       <w:pPr>
@@ -2334,17 +1833,8 @@
           <w:sz w:val="28"/>
           <w:szCs w:val="28"/>
         </w:rPr>
-        <w:t xml:space="preserve">verschillende Duck </w:t>
-      </w:r>
-      <w:proofErr w:type="spellStart"/>
-      <w:r>
-        <w:rPr>
-          <w:sz w:val="28"/>
-          <w:szCs w:val="28"/>
-        </w:rPr>
-        <w:t>subclasses</w:t>
-      </w:r>
-      <w:proofErr w:type="spellEnd"/>
+        <w:t>verschillende Duck subclasses</w:t>
+      </w:r>
       <w:r>
         <w:rPr>
           <w:sz w:val="28"/>
@@ -2386,7 +1876,6 @@
         </w:rPr>
         <w:t xml:space="preserve">De </w:t>
       </w:r>
-      <w:proofErr w:type="spellStart"/>
       <w:r>
         <w:rPr>
           <w:b/>
@@ -2396,7 +1885,6 @@
         </w:rPr>
         <w:t>MallardDuck</w:t>
       </w:r>
-      <w:proofErr w:type="spellEnd"/>
       <w:r>
         <w:rPr>
           <w:sz w:val="28"/>
@@ -2404,7 +1892,6 @@
         </w:rPr>
         <w:t xml:space="preserve"> en </w:t>
       </w:r>
-      <w:proofErr w:type="spellStart"/>
       <w:r>
         <w:rPr>
           <w:b/>
@@ -2414,7 +1901,6 @@
         </w:rPr>
         <w:t>RedheadDuck</w:t>
       </w:r>
-      <w:proofErr w:type="spellEnd"/>
       <w:r>
         <w:rPr>
           <w:sz w:val="28"/>
@@ -2422,7 +1908,6 @@
         </w:rPr>
         <w:t xml:space="preserve"> moeten </w:t>
       </w:r>
-      <w:proofErr w:type="spellStart"/>
       <w:r>
         <w:rPr>
           <w:i/>
@@ -2432,7 +1917,6 @@
         </w:rPr>
         <w:t>RegularQuack</w:t>
       </w:r>
-      <w:proofErr w:type="spellEnd"/>
       <w:r>
         <w:rPr>
           <w:sz w:val="28"/>
@@ -2440,7 +1924,6 @@
         </w:rPr>
         <w:t xml:space="preserve"> en </w:t>
       </w:r>
-      <w:proofErr w:type="spellStart"/>
       <w:r>
         <w:rPr>
           <w:i/>
@@ -2450,7 +1933,6 @@
         </w:rPr>
         <w:t>FlyWithWings</w:t>
       </w:r>
-      <w:proofErr w:type="spellEnd"/>
       <w:r>
         <w:rPr>
           <w:sz w:val="28"/>
@@ -2478,7 +1960,6 @@
         </w:rPr>
         <w:t xml:space="preserve">De </w:t>
       </w:r>
-      <w:proofErr w:type="spellStart"/>
       <w:r>
         <w:rPr>
           <w:b/>
@@ -2488,7 +1969,6 @@
         </w:rPr>
         <w:t>DecoyDuck</w:t>
       </w:r>
-      <w:proofErr w:type="spellEnd"/>
       <w:r>
         <w:rPr>
           <w:sz w:val="28"/>
@@ -2496,7 +1976,6 @@
         </w:rPr>
         <w:t xml:space="preserve"> moet </w:t>
       </w:r>
-      <w:proofErr w:type="spellStart"/>
       <w:r>
         <w:rPr>
           <w:i/>
@@ -2506,7 +1985,6 @@
         </w:rPr>
         <w:t>MuteQuack</w:t>
       </w:r>
-      <w:proofErr w:type="spellEnd"/>
       <w:r>
         <w:rPr>
           <w:sz w:val="28"/>
@@ -2514,7 +1992,6 @@
         </w:rPr>
         <w:t xml:space="preserve"> en </w:t>
       </w:r>
-      <w:proofErr w:type="spellStart"/>
       <w:r>
         <w:rPr>
           <w:i/>
@@ -2524,7 +2001,6 @@
         </w:rPr>
         <w:t>FlyNoWay</w:t>
       </w:r>
-      <w:proofErr w:type="spellEnd"/>
       <w:r>
         <w:rPr>
           <w:sz w:val="28"/>
@@ -2552,7 +2028,6 @@
         </w:rPr>
         <w:t xml:space="preserve">De </w:t>
       </w:r>
-      <w:proofErr w:type="spellStart"/>
       <w:r>
         <w:rPr>
           <w:b/>
@@ -2562,7 +2037,6 @@
         </w:rPr>
         <w:t>RubberDuck</w:t>
       </w:r>
-      <w:proofErr w:type="spellEnd"/>
       <w:r>
         <w:rPr>
           <w:sz w:val="28"/>
@@ -2570,7 +2044,6 @@
         </w:rPr>
         <w:t xml:space="preserve"> moet </w:t>
       </w:r>
-      <w:proofErr w:type="spellStart"/>
       <w:r>
         <w:rPr>
           <w:i/>
@@ -2580,7 +2053,6 @@
         </w:rPr>
         <w:t>Squeak</w:t>
       </w:r>
-      <w:proofErr w:type="spellEnd"/>
       <w:r>
         <w:rPr>
           <w:sz w:val="28"/>
@@ -2588,7 +2060,6 @@
         </w:rPr>
         <w:t xml:space="preserve"> en </w:t>
       </w:r>
-      <w:proofErr w:type="spellStart"/>
       <w:r>
         <w:rPr>
           <w:i/>
@@ -2598,7 +2069,6 @@
         </w:rPr>
         <w:t>FlyNoWay</w:t>
       </w:r>
-      <w:proofErr w:type="spellEnd"/>
       <w:r>
         <w:rPr>
           <w:sz w:val="28"/>
@@ -2629,32 +2099,7 @@
           <w:sz w:val="28"/>
           <w:szCs w:val="28"/>
         </w:rPr>
-        <w:t xml:space="preserve">Gebruik de instanties in de </w:t>
-      </w:r>
-      <w:proofErr w:type="spellStart"/>
-      <w:proofErr w:type="gramStart"/>
-      <w:r>
-        <w:rPr>
-          <w:sz w:val="28"/>
-          <w:szCs w:val="28"/>
-        </w:rPr>
-        <w:t>Main</w:t>
-      </w:r>
-      <w:proofErr w:type="spellEnd"/>
-      <w:r>
-        <w:rPr>
-          <w:sz w:val="28"/>
-          <w:szCs w:val="28"/>
-        </w:rPr>
-        <w:t>(</w:t>
-      </w:r>
-      <w:proofErr w:type="gramEnd"/>
-      <w:r>
-        <w:rPr>
-          <w:sz w:val="28"/>
-          <w:szCs w:val="28"/>
-        </w:rPr>
-        <w:t>) om je interface implementaties te testen.</w:t>
+        <w:t>Gebruik de instanties in de Main() om je interface implementaties te testen.</w:t>
       </w:r>
       <w:r>
         <w:rPr>
@@ -2708,7 +2153,6 @@
         </w:rPr>
         <w:t xml:space="preserve">De klant wil ook ander zwemgedrag zien. De eenden moeten niet alleen kunnen drijven maar ook kunnen zinken. Voeg dit </w:t>
       </w:r>
-      <w:proofErr w:type="spellStart"/>
       <w:r>
         <w:rPr>
           <w:b/>
@@ -2720,7 +2164,6 @@
         </w:rPr>
         <w:t>SwimBehavior</w:t>
       </w:r>
-      <w:proofErr w:type="spellEnd"/>
       <w:r>
         <w:rPr>
           <w:sz w:val="28"/>
@@ -2747,25 +2190,8 @@
           <w:sz w:val="28"/>
           <w:szCs w:val="28"/>
         </w:rPr>
-        <w:t xml:space="preserve">en test het met een nieuwe Duck </w:t>
-      </w:r>
-      <w:proofErr w:type="spellStart"/>
-      <w:r>
-        <w:rPr>
-          <w:sz w:val="28"/>
-          <w:szCs w:val="28"/>
-        </w:rPr>
-        <w:t>subclass</w:t>
-      </w:r>
-      <w:proofErr w:type="spellEnd"/>
-      <w:r>
-        <w:rPr>
-          <w:sz w:val="28"/>
-          <w:szCs w:val="28"/>
-        </w:rPr>
-        <w:t xml:space="preserve"> genaamd </w:t>
-      </w:r>
-      <w:proofErr w:type="spellStart"/>
+        <w:t xml:space="preserve">en test het met een nieuwe Duck subclass genaamd </w:t>
+      </w:r>
       <w:r>
         <w:rPr>
           <w:b/>
@@ -2777,7 +2203,6 @@
         </w:rPr>
         <w:t>RobotDuck</w:t>
       </w:r>
-      <w:proofErr w:type="spellEnd"/>
       <w:r>
         <w:rPr>
           <w:sz w:val="28"/>
@@ -2817,39 +2242,8 @@
           <w:sz w:val="28"/>
           <w:szCs w:val="28"/>
         </w:rPr>
-        <w:t xml:space="preserve">on </w:t>
-      </w:r>
-      <w:proofErr w:type="spellStart"/>
-      <w:r>
-        <w:rPr>
-          <w:i/>
-          <w:iCs/>
-          <w:sz w:val="28"/>
-          <w:szCs w:val="28"/>
-        </w:rPr>
-        <w:t>the</w:t>
-      </w:r>
-      <w:proofErr w:type="spellEnd"/>
-      <w:r>
-        <w:rPr>
-          <w:i/>
-          <w:iCs/>
-          <w:sz w:val="28"/>
-          <w:szCs w:val="28"/>
-        </w:rPr>
-        <w:t xml:space="preserve"> </w:t>
-      </w:r>
-      <w:proofErr w:type="spellStart"/>
-      <w:r>
-        <w:rPr>
-          <w:i/>
-          <w:iCs/>
-          <w:sz w:val="28"/>
-          <w:szCs w:val="28"/>
-        </w:rPr>
-        <w:t>fly</w:t>
-      </w:r>
-      <w:proofErr w:type="spellEnd"/>
+        <w:t>on the fly</w:t>
+      </w:r>
       <w:r>
         <w:rPr>
           <w:sz w:val="28"/>
@@ -2857,7 +2251,6 @@
         </w:rPr>
         <w:t xml:space="preserve">” hun gedrag kunnen aanpassen. Hiervoor zijn de </w:t>
       </w:r>
-      <w:proofErr w:type="spellStart"/>
       <w:r>
         <w:rPr>
           <w:b/>
@@ -2869,7 +2262,6 @@
         </w:rPr>
         <w:t>SetFlyBehaviour</w:t>
       </w:r>
-      <w:proofErr w:type="spellEnd"/>
       <w:r>
         <w:rPr>
           <w:sz w:val="28"/>
@@ -2877,7 +2269,6 @@
         </w:rPr>
         <w:t xml:space="preserve"> en </w:t>
       </w:r>
-      <w:proofErr w:type="spellStart"/>
       <w:r>
         <w:rPr>
           <w:b/>
@@ -2889,23 +2280,13 @@
         </w:rPr>
         <w:t>SetQuackBehaviour</w:t>
       </w:r>
-      <w:proofErr w:type="spellEnd"/>
-      <w:r>
-        <w:rPr>
-          <w:sz w:val="28"/>
-          <w:szCs w:val="28"/>
-        </w:rPr>
-        <w:t xml:space="preserve"> </w:t>
-      </w:r>
-      <w:proofErr w:type="spellStart"/>
-      <w:r>
-        <w:rPr>
-          <w:sz w:val="28"/>
-          <w:szCs w:val="28"/>
-        </w:rPr>
-        <w:t>methods</w:t>
-      </w:r>
-      <w:proofErr w:type="spellEnd"/>
+      <w:r>
+        <w:rPr>
+          <w:sz w:val="28"/>
+          <w:szCs w:val="28"/>
+        </w:rPr>
+        <w:t xml:space="preserve"> methods</w:t>
+      </w:r>
       <w:r>
         <w:rPr>
           <w:sz w:val="28"/>
@@ -2913,7 +2294,6 @@
         </w:rPr>
         <w:t xml:space="preserve"> nodig. Voor het </w:t>
       </w:r>
-      <w:proofErr w:type="spellStart"/>
       <w:r>
         <w:rPr>
           <w:b/>
@@ -2925,7 +2305,6 @@
         </w:rPr>
         <w:t>SwimBehaviour</w:t>
       </w:r>
-      <w:proofErr w:type="spellEnd"/>
       <w:r>
         <w:rPr>
           <w:sz w:val="28"/>
@@ -2945,23 +2324,7 @@
           <w:sz w:val="28"/>
           <w:szCs w:val="28"/>
         </w:rPr>
-        <w:t xml:space="preserve"> </w:t>
-      </w:r>
-      <w:proofErr w:type="spellStart"/>
-      <w:r>
-        <w:rPr>
-          <w:sz w:val="28"/>
-          <w:szCs w:val="28"/>
-        </w:rPr>
-        <w:t>method</w:t>
-      </w:r>
-      <w:proofErr w:type="spellEnd"/>
-      <w:r>
-        <w:rPr>
-          <w:sz w:val="28"/>
-          <w:szCs w:val="28"/>
-        </w:rPr>
-        <w:t xml:space="preserve"> nodig.</w:t>
+        <w:t xml:space="preserve"> method nodig.</w:t>
       </w:r>
     </w:p>
     <w:p>
@@ -2988,7 +2351,6 @@
         </w:rPr>
         <w:t xml:space="preserve">Gebruik hiervoor C# </w:t>
       </w:r>
-      <w:proofErr w:type="spellStart"/>
       <w:r>
         <w:rPr>
           <w:b/>
@@ -2998,7 +2360,6 @@
         </w:rPr>
         <w:t>properties</w:t>
       </w:r>
-      <w:proofErr w:type="spellEnd"/>
       <w:r>
         <w:rPr>
           <w:sz w:val="28"/>
@@ -7250,6 +6611,7 @@
   <w:style w:type="character" w:default="1" w:styleId="Standaardalinea-lettertype">
     <w:name w:val="Default Paragraph Font"/>
     <w:uiPriority w:val="1"/>
+    <w:semiHidden/>
     <w:unhideWhenUsed/>
   </w:style>
   <w:style w:type="table" w:default="1" w:styleId="Standaardtabel">
@@ -8310,19 +7672,11 @@
 </file>
 
 <file path=customXml/item1.xml><?xml version="1.0" encoding="utf-8"?>
-<b:Sources xmlns:b="http://schemas.openxmlformats.org/officeDocument/2006/bibliography" xmlns="http://schemas.openxmlformats.org/officeDocument/2006/bibliography" SelectedStyle="/APASixthEditionOfficeOnline.xsl" StyleName="APA" Version="6"/>
+<?mso-contentType ?>
+<SharedContentType xmlns="Microsoft.SharePoint.Taxonomy.ContentTypeSync" SourceId="96173d46-5f7d-49bf-a64d-4dd4f1c458b8" ContentTypeId="0x0101" PreviousValue="false"/>
 </file>
 
 <file path=customXml/item2.xml><?xml version="1.0" encoding="utf-8"?>
-<?mso-contentType ?>
-<FormTemplates xmlns="http://schemas.microsoft.com/sharepoint/v3/contenttype/forms">
-  <Display>DocumentLibraryForm</Display>
-  <Edit>DocumentLibraryForm</Edit>
-  <New>DocumentLibraryForm</New>
-</FormTemplates>
-</file>
-
-<file path=customXml/item3.xml><?xml version="1.0" encoding="utf-8"?>
 <p:properties xmlns:p="http://schemas.microsoft.com/office/2006/metadata/properties" xmlns:xsi="http://www.w3.org/2001/XMLSchema-instance" xmlns:pc="http://schemas.microsoft.com/office/infopath/2007/PartnerControls">
   <documentManagement>
     <lcf76f155ced4ddcb4097134ff3c332f xmlns="bd273f67-5965-45f0-ac4e-d17ce83175e7">
@@ -8333,9 +7687,17 @@
 </p:properties>
 </file>
 
+<file path=customXml/item3.xml><?xml version="1.0" encoding="utf-8"?>
+<?mso-contentType ?>
+<FormTemplates xmlns="http://schemas.microsoft.com/sharepoint/v3/contenttype/forms">
+  <Display>DocumentLibraryForm</Display>
+  <Edit>DocumentLibraryForm</Edit>
+  <New>DocumentLibraryForm</New>
+</FormTemplates>
+</file>
+
 <file path=customXml/item4.xml><?xml version="1.0" encoding="utf-8"?>
-<?mso-contentType ?>
-<SharedContentType xmlns="Microsoft.SharePoint.Taxonomy.ContentTypeSync" SourceId="96173d46-5f7d-49bf-a64d-4dd4f1c458b8" ContentTypeId="0x0101" PreviousValue="false"/>
+<b:Sources xmlns:b="http://schemas.openxmlformats.org/officeDocument/2006/bibliography" xmlns="http://schemas.openxmlformats.org/officeDocument/2006/bibliography" SelectedStyle="/APASixthEditionOfficeOnline.xsl" StyleName="APA" Version="6"/>
 </file>
 
 <file path=customXml/item5.xml><?xml version="1.0" encoding="utf-8"?>
@@ -8594,22 +7956,14 @@
 </file>
 
 <file path=customXml/itemProps1.xml><?xml version="1.0" encoding="utf-8"?>
-<ds:datastoreItem xmlns:ds="http://schemas.openxmlformats.org/officeDocument/2006/customXml" ds:itemID="{6EC07A6A-086E-6045-A911-CB4E4D508AFB}">
+<ds:datastoreItem xmlns:ds="http://schemas.openxmlformats.org/officeDocument/2006/customXml" ds:itemID="{C036E063-0501-4A91-AF28-5142A9D2AD7E}">
   <ds:schemaRefs>
-    <ds:schemaRef ds:uri="http://schemas.openxmlformats.org/officeDocument/2006/bibliography"/>
+    <ds:schemaRef ds:uri="Microsoft.SharePoint.Taxonomy.ContentTypeSync"/>
   </ds:schemaRefs>
 </ds:datastoreItem>
 </file>
 
 <file path=customXml/itemProps2.xml><?xml version="1.0" encoding="utf-8"?>
-<ds:datastoreItem xmlns:ds="http://schemas.openxmlformats.org/officeDocument/2006/customXml" ds:itemID="{A25B3578-7C9B-41F5-A14A-14B3F302CC6A}">
-  <ds:schemaRefs>
-    <ds:schemaRef ds:uri="http://schemas.microsoft.com/sharepoint/v3/contenttype/forms"/>
-  </ds:schemaRefs>
-</ds:datastoreItem>
-</file>
-
-<file path=customXml/itemProps3.xml><?xml version="1.0" encoding="utf-8"?>
 <ds:datastoreItem xmlns:ds="http://schemas.openxmlformats.org/officeDocument/2006/customXml" ds:itemID="{A252A040-BE62-4C1B-9842-E4DC60FDA318}">
   <ds:schemaRefs>
     <ds:schemaRef ds:uri="http://schemas.microsoft.com/office/2006/metadata/properties"/>
@@ -8620,10 +7974,18 @@
 </ds:datastoreItem>
 </file>
 
+<file path=customXml/itemProps3.xml><?xml version="1.0" encoding="utf-8"?>
+<ds:datastoreItem xmlns:ds="http://schemas.openxmlformats.org/officeDocument/2006/customXml" ds:itemID="{A25B3578-7C9B-41F5-A14A-14B3F302CC6A}">
+  <ds:schemaRefs>
+    <ds:schemaRef ds:uri="http://schemas.microsoft.com/sharepoint/v3/contenttype/forms"/>
+  </ds:schemaRefs>
+</ds:datastoreItem>
+</file>
+
 <file path=customXml/itemProps4.xml><?xml version="1.0" encoding="utf-8"?>
-<ds:datastoreItem xmlns:ds="http://schemas.openxmlformats.org/officeDocument/2006/customXml" ds:itemID="{C036E063-0501-4A91-AF28-5142A9D2AD7E}">
+<ds:datastoreItem xmlns:ds="http://schemas.openxmlformats.org/officeDocument/2006/customXml" ds:itemID="{6EC07A6A-086E-6045-A911-CB4E4D508AFB}">
   <ds:schemaRefs>
-    <ds:schemaRef ds:uri="Microsoft.SharePoint.Taxonomy.ContentTypeSync"/>
+    <ds:schemaRef ds:uri="http://schemas.openxmlformats.org/officeDocument/2006/bibliography"/>
   </ds:schemaRefs>
 </ds:datastoreItem>
 </file>

</xml_diff>